<commit_message>
Task 1: redraw the loss curves so the training line is visible
Training and validation loss overlap almost exactly (final gap 0.008),
so the old plot hid the training line under validation. The new plot
draws training dashed on top and adds a panel zoomed in from step 2,000.
It is redrawn from the saved history in metrics_train.json with the new
`src/train.py --replot`; no retraining.

Also updates the notebook's figure, results.md, and my individual report
(Word + PDF), which now includes the Task 3 human audit results.

Co-Authored-By: Claude Opus 5.5 <noreply@anthropic.com>
</commit_message>
<xml_diff>
--- a/report/DATA266_Lab1_Report_Sivasurya_Chandran.docx
+++ b/report/DATA266_Lab1_Report_Sivasurya_Chandran.docx
@@ -49,7 +49,7 @@
         <w:spacing w:after="360"/>
         <w:jc w:val="center"/>
       </w:pPr>
-      <w:hyperlink w:history="1" r:id="rIdl-62_jcv9olpyiqoqpazt">
+      <w:hyperlink w:history="1" r:id="rId6uaozkniw5e3aizkk0lqx">
         <w:r>
           <w:rPr>
             <w:rStyle w:val="Hyperlink"/>
@@ -2411,7 +2411,7 @@
       <w:r>
         <w:drawing>
           <wp:inline distT="0" distB="0" distL="0" distR="0">
-            <wp:extent cx="5334000" cy="3048000"/>
+            <wp:extent cx="6096000" cy="2219325"/>
             <wp:effectExtent t="0" r="0" b="0" l="0"/>
             <wp:docPr id="1" name="" descr="" title=""/>
             <wp:cNvGraphicFramePr>
@@ -2436,7 +2436,7 @@
                   <pic:spPr bwMode="auto">
                     <a:xfrm>
                       <a:off x="0" y="0"/>
-                      <a:ext cx="5334000" cy="3048000"/>
+                      <a:ext cx="6096000" cy="2219325"/>
                     </a:xfrm>
                     <a:prstGeom prst="rect">
                       <a:avLst/>
@@ -2462,7 +2462,7 @@
           <w:sz w:val="19"/>
           <w:szCs w:val="19"/>
         </w:rPr>
-        <w:t xml:space="preserve">Figure 1. Training and validation loss over the 109,640 training steps.</w:t>
+        <w:t xml:space="preserve">Figure 1. Training (dashed) and validation loss: the whole run on the left, zoomed in from step 2,000 on the right.</w:t>
       </w:r>
     </w:p>
     <w:p>
@@ -2470,7 +2470,7 @@
         <w:spacing w:after="140" w:line="276"/>
       </w:pPr>
       <w:r>
-        <w:t xml:space="preserve">The loss drops very quickly in the first couple of thousand steps, while the model is learning basic spelling and the warm-up is still running. After that it improves slowly and steadily. The training and validation curves stay almost on top of each other for the whole run, and the final gap is only 0.008 nats.</w:t>
+        <w:t xml:space="preserve">The loss drops very quickly in the first couple of thousand steps, while the model is learning basic spelling and the warm-up is still running. After that it improves slowly and steadily. The training and validation curves stay almost on top of each other for the whole run (the zoomed panel shows training just below validation), and the final gap is only 0.008 nats.</w:t>
       </w:r>
     </w:p>
     <w:p>
@@ -10763,29 +10763,856 @@
         <w:t xml:space="preserve">Human audit.</w:t>
       </w:r>
       <w:r>
-        <w:t xml:space="preserve"> The 30 blinded samples and the two rating sheets are prepared in </w:t>
-      </w:r>
-      <w:r>
-        <w:rPr>
-          <w:rFonts w:ascii="Consolas" w:cs="Consolas" w:eastAsia="Consolas" w:hAnsi="Consolas"/>
-          <w:sz w:val="19"/>
-          <w:szCs w:val="19"/>
-        </w:rPr>
-        <w:t xml:space="preserve">checkpoints/audit/</w:t>
-      </w:r>
-      <w:r>
-        <w:t xml:space="preserve">. Each sample is scored from 1 to 5 for style, content and artifacts, and </w:t>
-      </w:r>
-      <w:r>
-        <w:rPr>
-          <w:rFonts w:ascii="Consolas" w:cs="Consolas" w:eastAsia="Consolas" w:hAnsi="Consolas"/>
-          <w:sz w:val="19"/>
-          <w:szCs w:val="19"/>
-        </w:rPr>
-        <w:t xml:space="preserve">src/human_audit.py score</w:t>
-      </w:r>
-      <w:r>
-        <w:t xml:space="preserve"> computes the average score, Cohen's kappa and the percentage of exact agreement. The two raters haven't filled in their sheets yet, so there are no human-audit numbers in this report.</w:t>
+        <w:t xml:space="preserve"> Thirty held-out photos were chosen with a fixed seed before anyone looked at the outputs, and saved as anonymous photo | translation pairs. Two raters scored each pair independently from 1 to 5:</w:t>
+      </w:r>
+    </w:p>
+    <w:tbl>
+      <w:tblPr>
+        <w:tblW w:type="dxa" w:w="9360"/>
+        <w:tblBorders>
+          <w:top w:val="single" w:color="auto" w:sz="4"/>
+          <w:left w:val="single" w:color="auto" w:sz="4"/>
+          <w:bottom w:val="single" w:color="auto" w:sz="4"/>
+          <w:right w:val="single" w:color="auto" w:sz="4"/>
+          <w:insideH w:val="single" w:color="auto" w:sz="4"/>
+          <w:insideV w:val="single" w:color="auto" w:sz="4"/>
+        </w:tblBorders>
+      </w:tblPr>
+      <w:tblGrid>
+        <w:gridCol w:w="2560"/>
+        <w:gridCol w:w="1000"/>
+        <w:gridCol w:w="1000"/>
+        <w:gridCol w:w="1000"/>
+        <w:gridCol w:w="1700"/>
+        <w:gridCol w:w="2100"/>
+      </w:tblGrid>
+      <w:tr>
+        <w:trPr>
+          <w:tblHeader/>
+        </w:trPr>
+        <w:tc>
+          <w:tcPr>
+            <w:tcW w:type="dxa" w:w="2560"/>
+            <w:tcBorders>
+              <w:top w:val="single" w:color="BFBFBF" w:sz="4"/>
+              <w:left w:val="single" w:color="BFBFBF" w:sz="4"/>
+              <w:bottom w:val="single" w:color="BFBFBF" w:sz="4"/>
+              <w:right w:val="single" w:color="BFBFBF" w:sz="4"/>
+            </w:tcBorders>
+            <w:shd w:fill="DCE6F1" w:color="auto" w:val="clear"/>
+            <w:tcMar>
+              <w:top w:type="dxa" w:w="60"/>
+              <w:left w:type="dxa" w:w="100"/>
+              <w:bottom w:type="dxa" w:w="60"/>
+              <w:right w:type="dxa" w:w="100"/>
+            </w:tcMar>
+          </w:tcPr>
+          <w:p>
+            <w:r>
+              <w:rPr>
+                <w:b/>
+                <w:bCs/>
+                <w:sz w:val="19"/>
+                <w:szCs w:val="19"/>
+              </w:rPr>
+              <w:t xml:space="preserve">Criterion</w:t>
+            </w:r>
+          </w:p>
+        </w:tc>
+        <w:tc>
+          <w:tcPr>
+            <w:tcW w:type="dxa" w:w="1000"/>
+            <w:tcBorders>
+              <w:top w:val="single" w:color="BFBFBF" w:sz="4"/>
+              <w:left w:val="single" w:color="BFBFBF" w:sz="4"/>
+              <w:bottom w:val="single" w:color="BFBFBF" w:sz="4"/>
+              <w:right w:val="single" w:color="BFBFBF" w:sz="4"/>
+            </w:tcBorders>
+            <w:shd w:fill="DCE6F1" w:color="auto" w:val="clear"/>
+            <w:tcMar>
+              <w:top w:type="dxa" w:w="60"/>
+              <w:left w:type="dxa" w:w="100"/>
+              <w:bottom w:type="dxa" w:w="60"/>
+              <w:right w:type="dxa" w:w="100"/>
+            </w:tcMar>
+          </w:tcPr>
+          <w:p>
+            <w:r>
+              <w:rPr>
+                <w:b/>
+                <w:bCs/>
+                <w:sz w:val="19"/>
+                <w:szCs w:val="19"/>
+              </w:rPr>
+              <w:t xml:space="preserve">Rater 1</w:t>
+            </w:r>
+          </w:p>
+        </w:tc>
+        <w:tc>
+          <w:tcPr>
+            <w:tcW w:type="dxa" w:w="1000"/>
+            <w:tcBorders>
+              <w:top w:val="single" w:color="BFBFBF" w:sz="4"/>
+              <w:left w:val="single" w:color="BFBFBF" w:sz="4"/>
+              <w:bottom w:val="single" w:color="BFBFBF" w:sz="4"/>
+              <w:right w:val="single" w:color="BFBFBF" w:sz="4"/>
+            </w:tcBorders>
+            <w:shd w:fill="DCE6F1" w:color="auto" w:val="clear"/>
+            <w:tcMar>
+              <w:top w:type="dxa" w:w="60"/>
+              <w:left w:type="dxa" w:w="100"/>
+              <w:bottom w:type="dxa" w:w="60"/>
+              <w:right w:type="dxa" w:w="100"/>
+            </w:tcMar>
+          </w:tcPr>
+          <w:p>
+            <w:r>
+              <w:rPr>
+                <w:b/>
+                <w:bCs/>
+                <w:sz w:val="19"/>
+                <w:szCs w:val="19"/>
+              </w:rPr>
+              <w:t xml:space="preserve">Rater 2</w:t>
+            </w:r>
+          </w:p>
+        </w:tc>
+        <w:tc>
+          <w:tcPr>
+            <w:tcW w:type="dxa" w:w="1000"/>
+            <w:tcBorders>
+              <w:top w:val="single" w:color="BFBFBF" w:sz="4"/>
+              <w:left w:val="single" w:color="BFBFBF" w:sz="4"/>
+              <w:bottom w:val="single" w:color="BFBFBF" w:sz="4"/>
+              <w:right w:val="single" w:color="BFBFBF" w:sz="4"/>
+            </w:tcBorders>
+            <w:shd w:fill="DCE6F1" w:color="auto" w:val="clear"/>
+            <w:tcMar>
+              <w:top w:type="dxa" w:w="60"/>
+              <w:left w:type="dxa" w:w="100"/>
+              <w:bottom w:type="dxa" w:w="60"/>
+              <w:right w:type="dxa" w:w="100"/>
+            </w:tcMar>
+          </w:tcPr>
+          <w:p>
+            <w:r>
+              <w:rPr>
+                <w:b/>
+                <w:bCs/>
+                <w:sz w:val="19"/>
+                <w:szCs w:val="19"/>
+              </w:rPr>
+              <w:t xml:space="preserve">Mean</w:t>
+            </w:r>
+          </w:p>
+        </w:tc>
+        <w:tc>
+          <w:tcPr>
+            <w:tcW w:type="dxa" w:w="1700"/>
+            <w:tcBorders>
+              <w:top w:val="single" w:color="BFBFBF" w:sz="4"/>
+              <w:left w:val="single" w:color="BFBFBF" w:sz="4"/>
+              <w:bottom w:val="single" w:color="BFBFBF" w:sz="4"/>
+              <w:right w:val="single" w:color="BFBFBF" w:sz="4"/>
+            </w:tcBorders>
+            <w:shd w:fill="DCE6F1" w:color="auto" w:val="clear"/>
+            <w:tcMar>
+              <w:top w:type="dxa" w:w="60"/>
+              <w:left w:type="dxa" w:w="100"/>
+              <w:bottom w:type="dxa" w:w="60"/>
+              <w:right w:type="dxa" w:w="100"/>
+            </w:tcMar>
+          </w:tcPr>
+          <w:p>
+            <w:r>
+              <w:rPr>
+                <w:b/>
+                <w:bCs/>
+                <w:sz w:val="19"/>
+                <w:szCs w:val="19"/>
+              </w:rPr>
+              <w:t xml:space="preserve">Cohen's κ (quadratic)</w:t>
+            </w:r>
+          </w:p>
+        </w:tc>
+        <w:tc>
+          <w:tcPr>
+            <w:tcW w:type="dxa" w:w="2100"/>
+            <w:tcBorders>
+              <w:top w:val="single" w:color="BFBFBF" w:sz="4"/>
+              <w:left w:val="single" w:color="BFBFBF" w:sz="4"/>
+              <w:bottom w:val="single" w:color="BFBFBF" w:sz="4"/>
+              <w:right w:val="single" w:color="BFBFBF" w:sz="4"/>
+            </w:tcBorders>
+            <w:shd w:fill="DCE6F1" w:color="auto" w:val="clear"/>
+            <w:tcMar>
+              <w:top w:type="dxa" w:w="60"/>
+              <w:left w:type="dxa" w:w="100"/>
+              <w:bottom w:type="dxa" w:w="60"/>
+              <w:right w:type="dxa" w:w="100"/>
+            </w:tcMar>
+          </w:tcPr>
+          <w:p>
+            <w:r>
+              <w:rPr>
+                <w:b/>
+                <w:bCs/>
+                <w:sz w:val="19"/>
+                <w:szCs w:val="19"/>
+              </w:rPr>
+              <w:t xml:space="preserve">Exact / within-1 agreement</w:t>
+            </w:r>
+          </w:p>
+        </w:tc>
+      </w:tr>
+      <w:tr>
+        <w:trPr>
+          <w:tblHeader w:val="off"/>
+        </w:trPr>
+        <w:tc>
+          <w:tcPr>
+            <w:tcW w:type="dxa" w:w="2560"/>
+            <w:tcBorders>
+              <w:top w:val="single" w:color="BFBFBF" w:sz="4"/>
+              <w:left w:val="single" w:color="BFBFBF" w:sz="4"/>
+              <w:bottom w:val="single" w:color="BFBFBF" w:sz="4"/>
+              <w:right w:val="single" w:color="BFBFBF" w:sz="4"/>
+            </w:tcBorders>
+            <w:tcMar>
+              <w:top w:type="dxa" w:w="60"/>
+              <w:left w:type="dxa" w:w="100"/>
+              <w:bottom w:type="dxa" w:w="60"/>
+              <w:right w:type="dxa" w:w="100"/>
+            </w:tcMar>
+          </w:tcPr>
+          <w:p>
+            <w:r>
+              <w:rPr>
+                <w:b/>
+                <w:bCs/>
+                <w:sz w:val="19"/>
+                <w:szCs w:val="19"/>
+              </w:rPr>
+              <w:t xml:space="preserve">Style (looks like a Monet)</w:t>
+            </w:r>
+          </w:p>
+        </w:tc>
+        <w:tc>
+          <w:tcPr>
+            <w:tcW w:type="dxa" w:w="1000"/>
+            <w:tcBorders>
+              <w:top w:val="single" w:color="BFBFBF" w:sz="4"/>
+              <w:left w:val="single" w:color="BFBFBF" w:sz="4"/>
+              <w:bottom w:val="single" w:color="BFBFBF" w:sz="4"/>
+              <w:right w:val="single" w:color="BFBFBF" w:sz="4"/>
+            </w:tcBorders>
+            <w:tcMar>
+              <w:top w:type="dxa" w:w="60"/>
+              <w:left w:type="dxa" w:w="100"/>
+              <w:bottom w:type="dxa" w:w="60"/>
+              <w:right w:type="dxa" w:w="100"/>
+            </w:tcMar>
+          </w:tcPr>
+          <w:p>
+            <w:r>
+              <w:rPr>
+                <w:sz w:val="19"/>
+                <w:szCs w:val="19"/>
+              </w:rPr>
+              <w:t xml:space="preserve">3.57</w:t>
+            </w:r>
+          </w:p>
+        </w:tc>
+        <w:tc>
+          <w:tcPr>
+            <w:tcW w:type="dxa" w:w="1000"/>
+            <w:tcBorders>
+              <w:top w:val="single" w:color="BFBFBF" w:sz="4"/>
+              <w:left w:val="single" w:color="BFBFBF" w:sz="4"/>
+              <w:bottom w:val="single" w:color="BFBFBF" w:sz="4"/>
+              <w:right w:val="single" w:color="BFBFBF" w:sz="4"/>
+            </w:tcBorders>
+            <w:tcMar>
+              <w:top w:type="dxa" w:w="60"/>
+              <w:left w:type="dxa" w:w="100"/>
+              <w:bottom w:type="dxa" w:w="60"/>
+              <w:right w:type="dxa" w:w="100"/>
+            </w:tcMar>
+          </w:tcPr>
+          <w:p>
+            <w:r>
+              <w:rPr>
+                <w:sz w:val="19"/>
+                <w:szCs w:val="19"/>
+              </w:rPr>
+              <w:t xml:space="preserve">3.73</w:t>
+            </w:r>
+          </w:p>
+        </w:tc>
+        <w:tc>
+          <w:tcPr>
+            <w:tcW w:type="dxa" w:w="1000"/>
+            <w:tcBorders>
+              <w:top w:val="single" w:color="BFBFBF" w:sz="4"/>
+              <w:left w:val="single" w:color="BFBFBF" w:sz="4"/>
+              <w:bottom w:val="single" w:color="BFBFBF" w:sz="4"/>
+              <w:right w:val="single" w:color="BFBFBF" w:sz="4"/>
+            </w:tcBorders>
+            <w:tcMar>
+              <w:top w:type="dxa" w:w="60"/>
+              <w:left w:type="dxa" w:w="100"/>
+              <w:bottom w:type="dxa" w:w="60"/>
+              <w:right w:type="dxa" w:w="100"/>
+            </w:tcMar>
+          </w:tcPr>
+          <w:p>
+            <w:r>
+              <w:rPr>
+                <w:sz w:val="19"/>
+                <w:szCs w:val="19"/>
+              </w:rPr>
+              <w:t xml:space="preserve">3.65</w:t>
+            </w:r>
+          </w:p>
+        </w:tc>
+        <w:tc>
+          <w:tcPr>
+            <w:tcW w:type="dxa" w:w="1700"/>
+            <w:tcBorders>
+              <w:top w:val="single" w:color="BFBFBF" w:sz="4"/>
+              <w:left w:val="single" w:color="BFBFBF" w:sz="4"/>
+              <w:bottom w:val="single" w:color="BFBFBF" w:sz="4"/>
+              <w:right w:val="single" w:color="BFBFBF" w:sz="4"/>
+            </w:tcBorders>
+            <w:tcMar>
+              <w:top w:type="dxa" w:w="60"/>
+              <w:left w:type="dxa" w:w="100"/>
+              <w:bottom w:type="dxa" w:w="60"/>
+              <w:right w:type="dxa" w:w="100"/>
+            </w:tcMar>
+          </w:tcPr>
+          <w:p>
+            <w:r>
+              <w:rPr>
+                <w:sz w:val="19"/>
+                <w:szCs w:val="19"/>
+              </w:rPr>
+              <w:t xml:space="preserve">0.13</w:t>
+            </w:r>
+          </w:p>
+        </w:tc>
+        <w:tc>
+          <w:tcPr>
+            <w:tcW w:type="dxa" w:w="2100"/>
+            <w:tcBorders>
+              <w:top w:val="single" w:color="BFBFBF" w:sz="4"/>
+              <w:left w:val="single" w:color="BFBFBF" w:sz="4"/>
+              <w:bottom w:val="single" w:color="BFBFBF" w:sz="4"/>
+              <w:right w:val="single" w:color="BFBFBF" w:sz="4"/>
+            </w:tcBorders>
+            <w:tcMar>
+              <w:top w:type="dxa" w:w="60"/>
+              <w:left w:type="dxa" w:w="100"/>
+              <w:bottom w:type="dxa" w:w="60"/>
+              <w:right w:type="dxa" w:w="100"/>
+            </w:tcMar>
+          </w:tcPr>
+          <w:p>
+            <w:r>
+              <w:rPr>
+                <w:sz w:val="19"/>
+                <w:szCs w:val="19"/>
+              </w:rPr>
+              <w:t xml:space="preserve">33% / 83%</w:t>
+            </w:r>
+          </w:p>
+        </w:tc>
+      </w:tr>
+      <w:tr>
+        <w:trPr>
+          <w:tblHeader w:val="off"/>
+        </w:trPr>
+        <w:tc>
+          <w:tcPr>
+            <w:tcW w:type="dxa" w:w="2560"/>
+            <w:tcBorders>
+              <w:top w:val="single" w:color="BFBFBF" w:sz="4"/>
+              <w:left w:val="single" w:color="BFBFBF" w:sz="4"/>
+              <w:bottom w:val="single" w:color="BFBFBF" w:sz="4"/>
+              <w:right w:val="single" w:color="BFBFBF" w:sz="4"/>
+            </w:tcBorders>
+            <w:tcMar>
+              <w:top w:type="dxa" w:w="60"/>
+              <w:left w:type="dxa" w:w="100"/>
+              <w:bottom w:type="dxa" w:w="60"/>
+              <w:right w:type="dxa" w:w="100"/>
+            </w:tcMar>
+          </w:tcPr>
+          <w:p>
+            <w:r>
+              <w:rPr>
+                <w:b/>
+                <w:bCs/>
+                <w:sz w:val="19"/>
+                <w:szCs w:val="19"/>
+              </w:rPr>
+              <w:t xml:space="preserve">Content (scene preserved)</w:t>
+            </w:r>
+          </w:p>
+        </w:tc>
+        <w:tc>
+          <w:tcPr>
+            <w:tcW w:type="dxa" w:w="1000"/>
+            <w:tcBorders>
+              <w:top w:val="single" w:color="BFBFBF" w:sz="4"/>
+              <w:left w:val="single" w:color="BFBFBF" w:sz="4"/>
+              <w:bottom w:val="single" w:color="BFBFBF" w:sz="4"/>
+              <w:right w:val="single" w:color="BFBFBF" w:sz="4"/>
+            </w:tcBorders>
+            <w:tcMar>
+              <w:top w:type="dxa" w:w="60"/>
+              <w:left w:type="dxa" w:w="100"/>
+              <w:bottom w:type="dxa" w:w="60"/>
+              <w:right w:type="dxa" w:w="100"/>
+            </w:tcMar>
+          </w:tcPr>
+          <w:p>
+            <w:r>
+              <w:rPr>
+                <w:sz w:val="19"/>
+                <w:szCs w:val="19"/>
+              </w:rPr>
+              <w:t xml:space="preserve">3.83</w:t>
+            </w:r>
+          </w:p>
+        </w:tc>
+        <w:tc>
+          <w:tcPr>
+            <w:tcW w:type="dxa" w:w="1000"/>
+            <w:tcBorders>
+              <w:top w:val="single" w:color="BFBFBF" w:sz="4"/>
+              <w:left w:val="single" w:color="BFBFBF" w:sz="4"/>
+              <w:bottom w:val="single" w:color="BFBFBF" w:sz="4"/>
+              <w:right w:val="single" w:color="BFBFBF" w:sz="4"/>
+            </w:tcBorders>
+            <w:tcMar>
+              <w:top w:type="dxa" w:w="60"/>
+              <w:left w:type="dxa" w:w="100"/>
+              <w:bottom w:type="dxa" w:w="60"/>
+              <w:right w:type="dxa" w:w="100"/>
+            </w:tcMar>
+          </w:tcPr>
+          <w:p>
+            <w:r>
+              <w:rPr>
+                <w:sz w:val="19"/>
+                <w:szCs w:val="19"/>
+              </w:rPr>
+              <w:t xml:space="preserve">4.03</w:t>
+            </w:r>
+          </w:p>
+        </w:tc>
+        <w:tc>
+          <w:tcPr>
+            <w:tcW w:type="dxa" w:w="1000"/>
+            <w:tcBorders>
+              <w:top w:val="single" w:color="BFBFBF" w:sz="4"/>
+              <w:left w:val="single" w:color="BFBFBF" w:sz="4"/>
+              <w:bottom w:val="single" w:color="BFBFBF" w:sz="4"/>
+              <w:right w:val="single" w:color="BFBFBF" w:sz="4"/>
+            </w:tcBorders>
+            <w:tcMar>
+              <w:top w:type="dxa" w:w="60"/>
+              <w:left w:type="dxa" w:w="100"/>
+              <w:bottom w:type="dxa" w:w="60"/>
+              <w:right w:type="dxa" w:w="100"/>
+            </w:tcMar>
+          </w:tcPr>
+          <w:p>
+            <w:r>
+              <w:rPr>
+                <w:sz w:val="19"/>
+                <w:szCs w:val="19"/>
+              </w:rPr>
+              <w:t xml:space="preserve">3.93</w:t>
+            </w:r>
+          </w:p>
+        </w:tc>
+        <w:tc>
+          <w:tcPr>
+            <w:tcW w:type="dxa" w:w="1700"/>
+            <w:tcBorders>
+              <w:top w:val="single" w:color="BFBFBF" w:sz="4"/>
+              <w:left w:val="single" w:color="BFBFBF" w:sz="4"/>
+              <w:bottom w:val="single" w:color="BFBFBF" w:sz="4"/>
+              <w:right w:val="single" w:color="BFBFBF" w:sz="4"/>
+            </w:tcBorders>
+            <w:tcMar>
+              <w:top w:type="dxa" w:w="60"/>
+              <w:left w:type="dxa" w:w="100"/>
+              <w:bottom w:type="dxa" w:w="60"/>
+              <w:right w:type="dxa" w:w="100"/>
+            </w:tcMar>
+          </w:tcPr>
+          <w:p>
+            <w:r>
+              <w:rPr>
+                <w:sz w:val="19"/>
+                <w:szCs w:val="19"/>
+              </w:rPr>
+              <w:t xml:space="preserve">0.29</w:t>
+            </w:r>
+          </w:p>
+        </w:tc>
+        <w:tc>
+          <w:tcPr>
+            <w:tcW w:type="dxa" w:w="2100"/>
+            <w:tcBorders>
+              <w:top w:val="single" w:color="BFBFBF" w:sz="4"/>
+              <w:left w:val="single" w:color="BFBFBF" w:sz="4"/>
+              <w:bottom w:val="single" w:color="BFBFBF" w:sz="4"/>
+              <w:right w:val="single" w:color="BFBFBF" w:sz="4"/>
+            </w:tcBorders>
+            <w:tcMar>
+              <w:top w:type="dxa" w:w="60"/>
+              <w:left w:type="dxa" w:w="100"/>
+              <w:bottom w:type="dxa" w:w="60"/>
+              <w:right w:type="dxa" w:w="100"/>
+            </w:tcMar>
+          </w:tcPr>
+          <w:p>
+            <w:r>
+              <w:rPr>
+                <w:sz w:val="19"/>
+                <w:szCs w:val="19"/>
+              </w:rPr>
+              <w:t xml:space="preserve">33% / 83%</w:t>
+            </w:r>
+          </w:p>
+        </w:tc>
+      </w:tr>
+      <w:tr>
+        <w:trPr>
+          <w:tblHeader w:val="off"/>
+        </w:trPr>
+        <w:tc>
+          <w:tcPr>
+            <w:tcW w:type="dxa" w:w="2560"/>
+            <w:tcBorders>
+              <w:top w:val="single" w:color="BFBFBF" w:sz="4"/>
+              <w:left w:val="single" w:color="BFBFBF" w:sz="4"/>
+              <w:bottom w:val="single" w:color="BFBFBF" w:sz="4"/>
+              <w:right w:val="single" w:color="BFBFBF" w:sz="4"/>
+            </w:tcBorders>
+            <w:tcMar>
+              <w:top w:type="dxa" w:w="60"/>
+              <w:left w:type="dxa" w:w="100"/>
+              <w:bottom w:type="dxa" w:w="60"/>
+              <w:right w:type="dxa" w:w="100"/>
+            </w:tcMar>
+          </w:tcPr>
+          <w:p>
+            <w:r>
+              <w:rPr>
+                <w:b/>
+                <w:bCs/>
+                <w:sz w:val="19"/>
+                <w:szCs w:val="19"/>
+              </w:rPr>
+              <w:t xml:space="preserve">Artifacts (5 = none)</w:t>
+            </w:r>
+          </w:p>
+        </w:tc>
+        <w:tc>
+          <w:tcPr>
+            <w:tcW w:type="dxa" w:w="1000"/>
+            <w:tcBorders>
+              <w:top w:val="single" w:color="BFBFBF" w:sz="4"/>
+              <w:left w:val="single" w:color="BFBFBF" w:sz="4"/>
+              <w:bottom w:val="single" w:color="BFBFBF" w:sz="4"/>
+              <w:right w:val="single" w:color="BFBFBF" w:sz="4"/>
+            </w:tcBorders>
+            <w:tcMar>
+              <w:top w:type="dxa" w:w="60"/>
+              <w:left w:type="dxa" w:w="100"/>
+              <w:bottom w:type="dxa" w:w="60"/>
+              <w:right w:type="dxa" w:w="100"/>
+            </w:tcMar>
+          </w:tcPr>
+          <w:p>
+            <w:r>
+              <w:rPr>
+                <w:sz w:val="19"/>
+                <w:szCs w:val="19"/>
+              </w:rPr>
+              <w:t xml:space="preserve">3.43</w:t>
+            </w:r>
+          </w:p>
+        </w:tc>
+        <w:tc>
+          <w:tcPr>
+            <w:tcW w:type="dxa" w:w="1000"/>
+            <w:tcBorders>
+              <w:top w:val="single" w:color="BFBFBF" w:sz="4"/>
+              <w:left w:val="single" w:color="BFBFBF" w:sz="4"/>
+              <w:bottom w:val="single" w:color="BFBFBF" w:sz="4"/>
+              <w:right w:val="single" w:color="BFBFBF" w:sz="4"/>
+            </w:tcBorders>
+            <w:tcMar>
+              <w:top w:type="dxa" w:w="60"/>
+              <w:left w:type="dxa" w:w="100"/>
+              <w:bottom w:type="dxa" w:w="60"/>
+              <w:right w:type="dxa" w:w="100"/>
+            </w:tcMar>
+          </w:tcPr>
+          <w:p>
+            <w:r>
+              <w:rPr>
+                <w:sz w:val="19"/>
+                <w:szCs w:val="19"/>
+              </w:rPr>
+              <w:t xml:space="preserve">4.07</w:t>
+            </w:r>
+          </w:p>
+        </w:tc>
+        <w:tc>
+          <w:tcPr>
+            <w:tcW w:type="dxa" w:w="1000"/>
+            <w:tcBorders>
+              <w:top w:val="single" w:color="BFBFBF" w:sz="4"/>
+              <w:left w:val="single" w:color="BFBFBF" w:sz="4"/>
+              <w:bottom w:val="single" w:color="BFBFBF" w:sz="4"/>
+              <w:right w:val="single" w:color="BFBFBF" w:sz="4"/>
+            </w:tcBorders>
+            <w:tcMar>
+              <w:top w:type="dxa" w:w="60"/>
+              <w:left w:type="dxa" w:w="100"/>
+              <w:bottom w:type="dxa" w:w="60"/>
+              <w:right w:type="dxa" w:w="100"/>
+            </w:tcMar>
+          </w:tcPr>
+          <w:p>
+            <w:r>
+              <w:rPr>
+                <w:sz w:val="19"/>
+                <w:szCs w:val="19"/>
+              </w:rPr>
+              <w:t xml:space="preserve">3.75</w:t>
+            </w:r>
+          </w:p>
+        </w:tc>
+        <w:tc>
+          <w:tcPr>
+            <w:tcW w:type="dxa" w:w="1700"/>
+            <w:tcBorders>
+              <w:top w:val="single" w:color="BFBFBF" w:sz="4"/>
+              <w:left w:val="single" w:color="BFBFBF" w:sz="4"/>
+              <w:bottom w:val="single" w:color="BFBFBF" w:sz="4"/>
+              <w:right w:val="single" w:color="BFBFBF" w:sz="4"/>
+            </w:tcBorders>
+            <w:tcMar>
+              <w:top w:type="dxa" w:w="60"/>
+              <w:left w:type="dxa" w:w="100"/>
+              <w:bottom w:type="dxa" w:w="60"/>
+              <w:right w:type="dxa" w:w="100"/>
+            </w:tcMar>
+          </w:tcPr>
+          <w:p>
+            <w:r>
+              <w:rPr>
+                <w:sz w:val="19"/>
+                <w:szCs w:val="19"/>
+              </w:rPr>
+              <w:t xml:space="preserve">0.28</w:t>
+            </w:r>
+          </w:p>
+        </w:tc>
+        <w:tc>
+          <w:tcPr>
+            <w:tcW w:type="dxa" w:w="2100"/>
+            <w:tcBorders>
+              <w:top w:val="single" w:color="BFBFBF" w:sz="4"/>
+              <w:left w:val="single" w:color="BFBFBF" w:sz="4"/>
+              <w:bottom w:val="single" w:color="BFBFBF" w:sz="4"/>
+              <w:right w:val="single" w:color="BFBFBF" w:sz="4"/>
+            </w:tcBorders>
+            <w:tcMar>
+              <w:top w:type="dxa" w:w="60"/>
+              <w:left w:type="dxa" w:w="100"/>
+              <w:bottom w:type="dxa" w:w="60"/>
+              <w:right w:type="dxa" w:w="100"/>
+            </w:tcMar>
+          </w:tcPr>
+          <w:p>
+            <w:r>
+              <w:rPr>
+                <w:sz w:val="19"/>
+                <w:szCs w:val="19"/>
+              </w:rPr>
+              <w:t xml:space="preserve">27% / 83%</w:t>
+            </w:r>
+          </w:p>
+        </w:tc>
+      </w:tr>
+      <w:tr>
+        <w:trPr>
+          <w:tblHeader w:val="off"/>
+        </w:trPr>
+        <w:tc>
+          <w:tcPr>
+            <w:tcW w:type="dxa" w:w="2560"/>
+            <w:tcBorders>
+              <w:top w:val="single" w:color="BFBFBF" w:sz="4"/>
+              <w:left w:val="single" w:color="BFBFBF" w:sz="4"/>
+              <w:bottom w:val="single" w:color="BFBFBF" w:sz="4"/>
+              <w:right w:val="single" w:color="BFBFBF" w:sz="4"/>
+            </w:tcBorders>
+            <w:tcMar>
+              <w:top w:type="dxa" w:w="60"/>
+              <w:left w:type="dxa" w:w="100"/>
+              <w:bottom w:type="dxa" w:w="60"/>
+              <w:right w:type="dxa" w:w="100"/>
+            </w:tcMar>
+          </w:tcPr>
+          <w:p>
+            <w:r>
+              <w:rPr>
+                <w:b/>
+                <w:bCs/>
+                <w:sz w:val="19"/>
+                <w:szCs w:val="19"/>
+              </w:rPr>
+              <w:t xml:space="preserve">Overall</w:t>
+            </w:r>
+          </w:p>
+        </w:tc>
+        <w:tc>
+          <w:tcPr>
+            <w:tcW w:type="dxa" w:w="1000"/>
+            <w:tcBorders>
+              <w:top w:val="single" w:color="BFBFBF" w:sz="4"/>
+              <w:left w:val="single" w:color="BFBFBF" w:sz="4"/>
+              <w:bottom w:val="single" w:color="BFBFBF" w:sz="4"/>
+              <w:right w:val="single" w:color="BFBFBF" w:sz="4"/>
+            </w:tcBorders>
+            <w:tcMar>
+              <w:top w:type="dxa" w:w="60"/>
+              <w:left w:type="dxa" w:w="100"/>
+              <w:bottom w:type="dxa" w:w="60"/>
+              <w:right w:type="dxa" w:w="100"/>
+            </w:tcMar>
+          </w:tcPr>
+          <w:p/>
+        </w:tc>
+        <w:tc>
+          <w:tcPr>
+            <w:tcW w:type="dxa" w:w="1000"/>
+            <w:tcBorders>
+              <w:top w:val="single" w:color="BFBFBF" w:sz="4"/>
+              <w:left w:val="single" w:color="BFBFBF" w:sz="4"/>
+              <w:bottom w:val="single" w:color="BFBFBF" w:sz="4"/>
+              <w:right w:val="single" w:color="BFBFBF" w:sz="4"/>
+            </w:tcBorders>
+            <w:tcMar>
+              <w:top w:type="dxa" w:w="60"/>
+              <w:left w:type="dxa" w:w="100"/>
+              <w:bottom w:type="dxa" w:w="60"/>
+              <w:right w:type="dxa" w:w="100"/>
+            </w:tcMar>
+          </w:tcPr>
+          <w:p/>
+        </w:tc>
+        <w:tc>
+          <w:tcPr>
+            <w:tcW w:type="dxa" w:w="1000"/>
+            <w:tcBorders>
+              <w:top w:val="single" w:color="BFBFBF" w:sz="4"/>
+              <w:left w:val="single" w:color="BFBFBF" w:sz="4"/>
+              <w:bottom w:val="single" w:color="BFBFBF" w:sz="4"/>
+              <w:right w:val="single" w:color="BFBFBF" w:sz="4"/>
+            </w:tcBorders>
+            <w:tcMar>
+              <w:top w:type="dxa" w:w="60"/>
+              <w:left w:type="dxa" w:w="100"/>
+              <w:bottom w:type="dxa" w:w="60"/>
+              <w:right w:type="dxa" w:w="100"/>
+            </w:tcMar>
+          </w:tcPr>
+          <w:p>
+            <w:r>
+              <w:rPr>
+                <w:sz w:val="19"/>
+                <w:szCs w:val="19"/>
+              </w:rPr>
+              <w:t xml:space="preserve">3.78</w:t>
+            </w:r>
+          </w:p>
+        </w:tc>
+        <w:tc>
+          <w:tcPr>
+            <w:tcW w:type="dxa" w:w="1700"/>
+            <w:tcBorders>
+              <w:top w:val="single" w:color="BFBFBF" w:sz="4"/>
+              <w:left w:val="single" w:color="BFBFBF" w:sz="4"/>
+              <w:bottom w:val="single" w:color="BFBFBF" w:sz="4"/>
+              <w:right w:val="single" w:color="BFBFBF" w:sz="4"/>
+            </w:tcBorders>
+            <w:tcMar>
+              <w:top w:type="dxa" w:w="60"/>
+              <w:left w:type="dxa" w:w="100"/>
+              <w:bottom w:type="dxa" w:w="60"/>
+              <w:right w:type="dxa" w:w="100"/>
+            </w:tcMar>
+          </w:tcPr>
+          <w:p>
+            <w:r>
+              <w:rPr>
+                <w:sz w:val="19"/>
+                <w:szCs w:val="19"/>
+              </w:rPr>
+              <w:t xml:space="preserve">0.24</w:t>
+            </w:r>
+          </w:p>
+        </w:tc>
+        <w:tc>
+          <w:tcPr>
+            <w:tcW w:type="dxa" w:w="2100"/>
+            <w:tcBorders>
+              <w:top w:val="single" w:color="BFBFBF" w:sz="4"/>
+              <w:left w:val="single" w:color="BFBFBF" w:sz="4"/>
+              <w:bottom w:val="single" w:color="BFBFBF" w:sz="4"/>
+              <w:right w:val="single" w:color="BFBFBF" w:sz="4"/>
+            </w:tcBorders>
+            <w:tcMar>
+              <w:top w:type="dxa" w:w="60"/>
+              <w:left w:type="dxa" w:w="100"/>
+              <w:bottom w:type="dxa" w:w="60"/>
+              <w:right w:type="dxa" w:w="100"/>
+            </w:tcMar>
+          </w:tcPr>
+          <w:p>
+            <w:r>
+              <w:rPr>
+                <w:sz w:val="19"/>
+                <w:szCs w:val="19"/>
+              </w:rPr>
+              <w:t xml:space="preserve">31% exact</w:t>
+            </w:r>
+          </w:p>
+        </w:tc>
+      </w:tr>
+    </w:tbl>
+    <w:p>
+      <w:pPr>
+        <w:spacing w:after="120"/>
+      </w:pPr>
+    </w:p>
+    <w:p>
+      <w:pPr>
+        <w:spacing w:after="140" w:line="276"/>
+      </w:pPr>
+      <w:r>
+        <w:t xml:space="preserve">Content was rated highest and style lowest, which fits the rest of the evaluation: the scene almost always survives, but the result doesn't always look like Monet. Agreement was only fair (κ 0.24). The raters were within one point 83% of the time, though, and rater 2 was more lenient, especially on artifacts. Most disagreements were a shift in scale, not opposite opinions.</w:t>
       </w:r>
     </w:p>
     <w:p>
@@ -12179,7 +13006,7 @@
         <w:spacing w:after="80" w:line="276"/>
       </w:pPr>
       <w:r>
-        <w:t xml:space="preserve">The human audit still needs its two raters.</w:t>
+        <w:t xml:space="preserve">The two raters agreed only fairly (κ 0.24). A short calibration round on a few shared examples before rating would make the human scores more reliable.</w:t>
       </w:r>
     </w:p>
     <w:p>

</xml_diff>

<commit_message>
Task 3: record the final Kaggle submission
The final model's submission.csv was uploaded on 2026-10-04: public
score -51.1585. The team stays at public rank 11, ranked on its best
entry (v3, -45.9695). Recorded in submission_details.json, the metric
tables, results.md, the executed notebook, my report (Word + PDF) and
the team report (md + PDF). Adds kaggle_submissions/final_submission.csv.

Co-Authored-By: Claude Opus 5.5 <noreply@anthropic.com>
</commit_message>
<xml_diff>
--- a/report/DATA266_Lab1_Report_Sivasurya_Chandran.docx
+++ b/report/DATA266_Lab1_Report_Sivasurya_Chandran.docx
@@ -49,7 +49,7 @@
         <w:spacing w:after="360"/>
         <w:jc w:val="center"/>
       </w:pPr>
-      <w:hyperlink w:history="1" r:id="rId6uaozkniw5e3aizkk0lqx">
+      <w:hyperlink w:history="1" r:id="rIdw3fbrfge4ovwn4e32_nf2">
         <w:r>
           <w:rPr>
             <w:rStyle w:val="Hyperlink"/>
@@ -9779,18 +9779,7 @@
         <w:spacing w:after="140" w:line="276"/>
       </w:pPr>
       <w:r>
-        <w:t xml:space="preserve">On the leaderboard, which shows −(FID + MiFID)/2, this entry would score −51.16. Our team (PairProgramming_Team_06) was ranked 11th on the public board on 3 October, with its best entry at −45.97. That entry was my v3 model, scored with my own earlier scorer before the instructor's script was shared, so it isn't directly comparable. The final model's submission is ready in </w:t>
-      </w:r>
-      <w:r>
-        <w:rPr>
-          <w:rFonts w:ascii="Consolas" w:cs="Consolas" w:eastAsia="Consolas" w:hAnsi="Consolas"/>
-          <w:sz w:val="19"/>
-          <w:szCs w:val="19"/>
-        </w:rPr>
-        <w:t xml:space="preserve">submission.csv</w:t>
-      </w:r>
-      <w:r>
-        <w:t xml:space="preserve">.</w:t>
+        <w:t xml:space="preserve">I uploaded this submission on 4 October, and Kaggle shows a public score of −51.1585, which is −(FID + MiFID)/2 of the submitted values. Our team (PairProgramming_Team_06) is ranked 11th on the public board. Kaggle ranks a team by its best entry, which is still my v3 at −45.97. That entry was scored with my own earlier scorer before the instructor's script was shared, so it isn't directly comparable with the final model's score.</w:t>
       </w:r>
     </w:p>
     <w:p>

</xml_diff>